<commit_message>
Fine-tune image clients on ~1,000 real photos; add confusion-matrix figures to paper
- configs/images.yaml: 125 real training photos per fold (was 13) and 300 fold-9 photos (was 60)
- outputs/images: retrained image clients A-D, gate and triage (seed 42); fold-10 photo test
  re-run once on the same 100 photos: image gate AUROC 0.841 -> 0.890, F1 0.558 -> 0.584
- outputs/fourclient/figures: combined-model, per-client and 5-class (single-label) confusion matrices
- paper: Fig. 10 now the combined-model matrices, new Fig. 11 per-client matrices, later figures
  renumbered; Word version uses Times New Roman throughout
- RESULTS.md: summary of the image retraining
</commit_message>
<xml_diff>
--- a/paper/CardioSentinel_onecolumn.docx
+++ b/paper/CardioSentinel_onecolumn.docx
@@ -31040,7 +31040,7 @@
         <w:t xml:space="preserve"> </w:t>
       </w:r>
       <w:r>
-        <w:t xml:space="preserve">and 0.64 for CD and HYP), and Fig. 11 the corresponding ROC curves. Because the task is</w:t>
+        <w:t>and 0.64 for CD and HYP), and Fig. 12 the corresponding ROC curves. Because the task is</w:t>
       </w:r>
       <w:r>
         <w:t xml:space="preserve"> </w:t>
@@ -31069,7 +31069,7 @@
         <w:t xml:space="preserve"> </w:t>
       </w:r>
       <w:r>
-        <w:t xml:space="preserve">matrix.</w:t>
+        <w:t>matrix. Fig. 11 sets these matrices beside those of the four individual clients: the combined model finds the most MI positives (437 against 408–431) and has the fewest MI and CD false positives (200 against 226–258, and 58 against 110–163), whereas clients A and D find slightly more NORM positives (910 and 909 against 887) and client D the most HYP positives (145 against 129).</w:t>
       </w:r>
     </w:p>
     <w:p>
@@ -31080,20 +31080,20 @@
       <w:r>
         <w:drawing>
           <wp:inline>
-            <wp:extent cx="5334000" cy="1319388"/>
+            <wp:extent cx="5943600" cy="1261583"/>
             <wp:effectExtent b="0" l="0" r="0" t="0"/>
             <wp:docPr descr="" title="" id="68" name="Picture"/>
             <a:graphic>
               <a:graphicData uri="http://schemas.openxmlformats.org/drawingml/2006/picture">
                 <pic:pic>
                   <pic:nvPicPr>
-                    <pic:cNvPr descr="confusion.png" id="69" name="Picture"/>
+                    <pic:cNvPr descr="confusion_combined_model.png" id="69" name="Picture"/>
                     <pic:cNvPicPr>
                       <a:picLocks noChangeArrowheads="1" noChangeAspect="1"/>
                     </pic:cNvPicPr>
                   </pic:nvPicPr>
                   <pic:blipFill>
-                    <a:blip r:embed="rId67"/>
+                    <a:blip r:embed="rId9"/>
                     <a:stretch>
                       <a:fillRect/>
                     </a:stretch>
@@ -31101,7 +31101,7 @@
                   <pic:spPr bwMode="auto">
                     <a:xfrm>
                       <a:off x="0" y="0"/>
-                      <a:ext cx="5334000" cy="1319388"/>
+                      <a:ext cx="5943600" cy="1261583"/>
                     </a:xfrm>
                     <a:prstGeom prst="rect">
                       <a:avLst/>
@@ -31125,14 +31125,68 @@
         <w:pStyle w:val="ImageCaption"/>
       </w:pPr>
       <w:r>
-        <w:t xml:space="preserve">Fig. 10. Per-class confusion matrices of the proposed model on the test fold (seed 42); counts and</w:t>
-      </w:r>
-      <w:r>
-        <w:t xml:space="preserve"> </w:t>
-      </w:r>
-      <w:r>
-        <w:t xml:space="preserve">row-normalised rates.</w:t>
-      </w:r>
+        <w:t>Fig. 10. Per-class confusion matrices of the proposed model (equal-weight combination of clients A–D) on the test fold (fold 10, 2,158 records, seed 42); counts and row-normalised rates, so TP% is the recall and TN% the specificity.</w:t>
+      </w:r>
+      <w:r/>
+      <w:r/>
+    </w:p>
+    <w:p>
+      <w:pPr>
+        <w:pStyle w:val="CaptionedFigure"/>
+        <w:jc w:val="center"/>
+      </w:pPr>
+      <w:r>
+        <w:drawing>
+          <wp:inline>
+            <wp:extent cx="5943600" cy="5945681"/>
+            <wp:effectExtent b="0" l="0" r="0" t="0"/>
+            <wp:docPr descr="" title="" id="9001" name="Picture"/>
+            <a:graphic>
+              <a:graphicData uri="http://schemas.openxmlformats.org/drawingml/2006/picture">
+                <pic:pic>
+                  <pic:nvPicPr>
+                    <pic:cNvPr descr="confusion_each_client.png" id="69" name="Picture"/>
+                    <pic:cNvPicPr>
+                      <a:picLocks noChangeArrowheads="1" noChangeAspect="1"/>
+                    </pic:cNvPicPr>
+                  </pic:nvPicPr>
+                  <pic:blipFill>
+                    <a:blip r:embed="rId10"/>
+                    <a:stretch>
+                      <a:fillRect/>
+                    </a:stretch>
+                  </pic:blipFill>
+                  <pic:spPr bwMode="auto">
+                    <a:xfrm>
+                      <a:off x="0" y="0"/>
+                      <a:ext cx="5943600" cy="5945681"/>
+                    </a:xfrm>
+                    <a:prstGeom prst="rect">
+                      <a:avLst/>
+                    </a:prstGeom>
+                    <a:noFill/>
+                    <a:ln w="9525">
+                      <a:noFill/>
+                      <a:headEnd/>
+                      <a:tailEnd/>
+                    </a:ln>
+                  </pic:spPr>
+                </pic:pic>
+              </a:graphicData>
+            </a:graphic>
+          </wp:inline>
+        </w:drawing>
+      </w:r>
+    </w:p>
+    <w:p>
+      <w:pPr>
+        <w:pStyle w:val="ImageCaption"/>
+      </w:pPr>
+      <w:r>
+        <w:t>Fig. 11. Per-class confusion matrices of the four clients (A CNN, B ResNet, C BiLSTM, D CNN-LSTM) and of the combined model (bottom row) on the test fold (seed 42), row-normalised as in Fig. 10.</w:t>
+      </w:r>
+      <w:r/>
+      <w:r/>
     </w:p>
     <w:p>
       <w:pPr>
@@ -31187,7 +31241,7 @@
         <w:pStyle w:val="ImageCaption"/>
       </w:pPr>
       <w:r>
-        <w:t xml:space="preserve">Fig. 11. ROC curves of the proposed model on the test fold for the five superclasses (seed 42).</w:t>
+        <w:t>Fig. 12. ROC curves of the proposed model on the test fold for the five superclasses (seed 42).</w:t>
       </w:r>
     </w:p>
     <w:p>
@@ -32218,7 +32272,7 @@
         <w:t xml:space="preserve"> </w:t>
       </w:r>
       <w:r>
-        <w:t xml:space="preserve">the test fold was not used. Fig. 12 shows the global lead importance, i.e. the share</w:t>
+        <w:t>the test fold was not used. Fig. 13 shows the global lead importance, i.e. the share</w:t>
       </w:r>
       <w:r>
         <w:t xml:space="preserve"> </w:t>
@@ -32286,7 +32340,7 @@
         <w:pStyle w:val="ImageCaption"/>
       </w:pPr>
       <w:r>
-        <w:t xml:space="preserve">Fig. 12. Global explanation: share of the absolute Integrated-Gradients attribution per lead (%)</w:t>
+        <w:t>Fig. 13. Global explanation: share of the absolute Integrated-Gradients attribution per lead (%)</w:t>
       </w:r>
       <w:r>
         <w:t xml:space="preserve"> </w:t>
@@ -32384,7 +32438,7 @@
         <w:t xml:space="preserve"> </w:t>
       </w:r>
       <w:r>
-        <w:t xml:space="preserve">Fig. 13 shows the two validation records predicted with</w:t>
+        <w:t>Fig. 14 shows the two validation records predicted with</w:t>
       </w:r>
       <w:r>
         <w:t xml:space="preserve"> </w:t>
@@ -32494,7 +32548,7 @@
         <w:pStyle w:val="ImageCaption"/>
       </w:pPr>
       <w:r>
-        <w:t xml:space="preserve">Fig. 13. Local explanations for the most confident true-positive (a) MI and (b) STTC validation</w:t>
+        <w:t>Fig. 14. Local explanations for the most confident true-positive (a) MI and (b) STTC validation</w:t>
       </w:r>
       <w:r>
         <w:t xml:space="preserve"> </w:t>
@@ -38818,7 +38872,7 @@
     </a:clrScheme>
     <a:fontScheme name="Office">
       <a:majorFont>
-        <a:latin typeface="Aptos Display" panose="02110004020202020204"/>
+        <a:latin typeface="Times New Roman" panose="02110004020202020204"/>
         <a:ea typeface=""/>
         <a:cs typeface=""/>
         <a:font script="Jpan" typeface="游ゴシック Light"/>
@@ -38870,7 +38924,7 @@
         <a:font script="Tfng" typeface="Ebrima"/>
       </a:majorFont>
       <a:minorFont>
-        <a:latin typeface="Aptos" panose="02110004020202020204"/>
+        <a:latin typeface="Times New Roman" panose="02110004020202020204"/>
         <a:ea typeface=""/>
         <a:cs typeface=""/>
         <a:font script="Jpan" typeface="游明朝"/>

</xml_diff>